<commit_message>
chore(week3): add link github for week3 document
</commit_message>
<xml_diff>
--- a/TranTuanHung_23659581_Week_3/TranTuanHung_23659581.docx
+++ b/TranTuanHung_23659581_Week_3/TranTuanHung_23659581.docx
@@ -7,6 +7,109 @@
         <w:pBdr>
           <w:bottom w:val="single" w:sz="2" w:space="1" w:color="CCCCCC"/>
         </w:pBdr>
+        <w:jc w:val="center"/>
+        <w:rPr>
+          <w:b/>
+          <w:bCs/>
+          <w:sz w:val="36"/>
+          <w:szCs w:val="36"/>
+        </w:rPr>
+      </w:pPr>
+      <w:r>
+        <w:rPr>
+          <w:b/>
+          <w:bCs/>
+          <w:sz w:val="36"/>
+          <w:szCs w:val="36"/>
+        </w:rPr>
+        <w:t>BÀI TẬP THỰC HÀNH REACT NATIVE</w:t>
+      </w:r>
+    </w:p>
+    <w:p>
+      <w:pPr>
+        <w:pBdr>
+          <w:bottom w:val="single" w:sz="2" w:space="1" w:color="CCCCCC"/>
+        </w:pBdr>
+        <w:jc w:val="center"/>
+        <w:rPr>
+          <w:b/>
+          <w:bCs/>
+          <w:sz w:val="36"/>
+          <w:szCs w:val="36"/>
+        </w:rPr>
+      </w:pPr>
+      <w:r>
+        <w:rPr>
+          <w:b/>
+          <w:bCs/>
+          <w:sz w:val="36"/>
+          <w:szCs w:val="36"/>
+        </w:rPr>
+        <w:t>Chủ đề: LAYOUT với Flexbox — Ứng dụng BookStore Online</w:t>
+      </w:r>
+    </w:p>
+    <w:p>
+      <w:pPr>
+        <w:pBdr>
+          <w:bottom w:val="single" w:sz="2" w:space="1" w:color="CCCCCC"/>
+        </w:pBdr>
+        <w:jc w:val="center"/>
+        <w:rPr>
+          <w:b/>
+          <w:bCs/>
+          <w:sz w:val="22"/>
+          <w:szCs w:val="22"/>
+        </w:rPr>
+      </w:pPr>
+      <w:r>
+        <w:rPr>
+          <w:b/>
+          <w:bCs/>
+          <w:sz w:val="22"/>
+          <w:szCs w:val="22"/>
+        </w:rPr>
+        <w:t xml:space="preserve">Link github: </w:t>
+      </w:r>
+      <w:hyperlink r:id="rId5" w:history="1">
+        <w:r>
+          <w:rPr>
+            <w:rStyle w:val="Hyperlink"/>
+            <w:b/>
+            <w:bCs/>
+            <w:sz w:val="22"/>
+            <w:szCs w:val="22"/>
+          </w:rPr>
+          <w:t>https://github.com/trantuanhung1209/React_Native_Lab/tree/main/TranTuanHung_23659581_Week_3</w:t>
+        </w:r>
+      </w:hyperlink>
+      <w:r>
+        <w:rPr>
+          <w:b/>
+          <w:bCs/>
+          <w:sz w:val="22"/>
+          <w:szCs w:val="22"/>
+        </w:rPr>
+        <w:t xml:space="preserve"> </w:t>
+      </w:r>
+    </w:p>
+    <w:p>
+      <w:pPr>
+        <w:pBdr>
+          <w:bottom w:val="single" w:sz="2" w:space="1" w:color="CCCCCC"/>
+        </w:pBdr>
+        <w:rPr>
+          <w:b/>
+          <w:bCs/>
+          <w:sz w:val="22"/>
+          <w:szCs w:val="22"/>
+        </w:rPr>
+      </w:pPr>
+    </w:p>
+    <w:p>
+      <w:pPr>
+        <w:pBdr>
+          <w:bottom w:val="single" w:sz="2" w:space="1" w:color="CCCCCC"/>
+        </w:pBdr>
         <w:rPr>
           <w:b/>
           <w:bCs/>
@@ -60,6 +163,9 @@
         </w:pBdr>
       </w:pPr>
       <w:r>
+        <w:rPr>
+          <w:noProof/>
+        </w:rPr>
         <w:drawing>
           <wp:inline distT="0" distB="0" distL="0" distR="0" wp14:anchorId="79965D35" wp14:editId="06E85D2B">
             <wp:extent cx="6290310" cy="3388995"/>
@@ -76,7 +182,7 @@
                     <pic:cNvPicPr/>
                   </pic:nvPicPr>
                   <pic:blipFill>
-                    <a:blip r:embed="rId5"/>
+                    <a:blip r:embed="rId6"/>
                     <a:stretch>
                       <a:fillRect/>
                     </a:stretch>
@@ -136,6 +242,9 @@
         </w:pBdr>
       </w:pPr>
       <w:r>
+        <w:rPr>
+          <w:noProof/>
+        </w:rPr>
         <w:drawing>
           <wp:inline distT="0" distB="0" distL="0" distR="0" wp14:anchorId="6D412EB4" wp14:editId="2BF42BA1">
             <wp:extent cx="6290310" cy="3211830"/>
@@ -152,7 +261,7 @@
                     <pic:cNvPicPr/>
                   </pic:nvPicPr>
                   <pic:blipFill>
-                    <a:blip r:embed="rId6"/>
+                    <a:blip r:embed="rId7"/>
                     <a:stretch>
                       <a:fillRect/>
                     </a:stretch>
@@ -231,6 +340,9 @@
         </w:pBdr>
       </w:pPr>
       <w:r>
+        <w:rPr>
+          <w:noProof/>
+        </w:rPr>
         <w:lastRenderedPageBreak/>
         <w:drawing>
           <wp:inline distT="0" distB="0" distL="0" distR="0" wp14:anchorId="01484A60" wp14:editId="189DA064">
@@ -245,86 +357,6 @@
                 <pic:pic xmlns:pic="http://schemas.openxmlformats.org/drawingml/2006/picture">
                   <pic:nvPicPr>
                     <pic:cNvPr id="1386162492" name=""/>
-                    <pic:cNvPicPr/>
-                  </pic:nvPicPr>
-                  <pic:blipFill>
-                    <a:blip r:embed="rId7"/>
-                    <a:stretch>
-                      <a:fillRect/>
-                    </a:stretch>
-                  </pic:blipFill>
-                  <pic:spPr>
-                    <a:xfrm>
-                      <a:off x="0" y="0"/>
-                      <a:ext cx="6290310" cy="3538220"/>
-                    </a:xfrm>
-                    <a:prstGeom prst="rect">
-                      <a:avLst/>
-                    </a:prstGeom>
-                  </pic:spPr>
-                </pic:pic>
-              </a:graphicData>
-            </a:graphic>
-          </wp:inline>
-        </w:drawing>
-      </w:r>
-    </w:p>
-    <w:p>
-      <w:pPr>
-        <w:pBdr>
-          <w:bottom w:val="single" w:sz="2" w:space="1" w:color="CCCCCC"/>
-        </w:pBdr>
-      </w:pPr>
-    </w:p>
-    <w:p>
-      <w:pPr>
-        <w:pBdr>
-          <w:bottom w:val="single" w:sz="2" w:space="1" w:color="CCCCCC"/>
-        </w:pBdr>
-      </w:pPr>
-    </w:p>
-    <w:p>
-      <w:pPr>
-        <w:pBdr>
-          <w:bottom w:val="single" w:sz="2" w:space="1" w:color="CCCCCC"/>
-        </w:pBdr>
-      </w:pPr>
-      <w:r>
-        <w:rPr>
-          <w:b/>
-          <w:bCs/>
-        </w:rPr>
-        <w:t>Bài tập 2: Lưới sản phẩm 2 cột (Book Grid)</w:t>
-      </w:r>
-    </w:p>
-    <w:p>
-      <w:pPr>
-        <w:pBdr>
-          <w:bottom w:val="single" w:sz="2" w:space="1" w:color="CCCCCC"/>
-        </w:pBdr>
-        <w:rPr>
-          <w:sz w:val="36"/>
-          <w:szCs w:val="36"/>
-        </w:rPr>
-      </w:pPr>
-      <w:r>
-        <w:rPr>
-          <w:sz w:val="36"/>
-          <w:szCs w:val="36"/>
-        </w:rPr>
-        <w:drawing>
-          <wp:inline distT="0" distB="0" distL="0" distR="0" wp14:anchorId="2443FE59" wp14:editId="45240EB2">
-            <wp:extent cx="6290310" cy="3538220"/>
-            <wp:effectExtent l="0" t="0" r="0" b="5080"/>
-            <wp:docPr id="494506925" name="Picture 1"/>
-            <wp:cNvGraphicFramePr>
-              <a:graphicFrameLocks xmlns:a="http://schemas.openxmlformats.org/drawingml/2006/main" noChangeAspect="1"/>
-            </wp:cNvGraphicFramePr>
-            <a:graphic xmlns:a="http://schemas.openxmlformats.org/drawingml/2006/main">
-              <a:graphicData uri="http://schemas.openxmlformats.org/drawingml/2006/picture">
-                <pic:pic xmlns:pic="http://schemas.openxmlformats.org/drawingml/2006/picture">
-                  <pic:nvPicPr>
-                    <pic:cNvPr id="494506925" name=""/>
                     <pic:cNvPicPr/>
                   </pic:nvPicPr>
                   <pic:blipFill>
@@ -354,6 +386,87 @@
         <w:pBdr>
           <w:bottom w:val="single" w:sz="2" w:space="1" w:color="CCCCCC"/>
         </w:pBdr>
+      </w:pPr>
+    </w:p>
+    <w:p>
+      <w:pPr>
+        <w:pBdr>
+          <w:bottom w:val="single" w:sz="2" w:space="1" w:color="CCCCCC"/>
+        </w:pBdr>
+      </w:pPr>
+    </w:p>
+    <w:p>
+      <w:pPr>
+        <w:pBdr>
+          <w:bottom w:val="single" w:sz="2" w:space="1" w:color="CCCCCC"/>
+        </w:pBdr>
+      </w:pPr>
+      <w:r>
+        <w:rPr>
+          <w:b/>
+          <w:bCs/>
+        </w:rPr>
+        <w:t>Bài tập 2: Lưới sản phẩm 2 cột (Book Grid)</w:t>
+      </w:r>
+    </w:p>
+    <w:p>
+      <w:pPr>
+        <w:pBdr>
+          <w:bottom w:val="single" w:sz="2" w:space="1" w:color="CCCCCC"/>
+        </w:pBdr>
+        <w:rPr>
+          <w:sz w:val="36"/>
+          <w:szCs w:val="36"/>
+        </w:rPr>
+      </w:pPr>
+      <w:r>
+        <w:rPr>
+          <w:noProof/>
+          <w:sz w:val="36"/>
+          <w:szCs w:val="36"/>
+        </w:rPr>
+        <w:drawing>
+          <wp:inline distT="0" distB="0" distL="0" distR="0" wp14:anchorId="2443FE59" wp14:editId="45240EB2">
+            <wp:extent cx="6290310" cy="3538220"/>
+            <wp:effectExtent l="0" t="0" r="0" b="5080"/>
+            <wp:docPr id="494506925" name="Picture 1"/>
+            <wp:cNvGraphicFramePr>
+              <a:graphicFrameLocks xmlns:a="http://schemas.openxmlformats.org/drawingml/2006/main" noChangeAspect="1"/>
+            </wp:cNvGraphicFramePr>
+            <a:graphic xmlns:a="http://schemas.openxmlformats.org/drawingml/2006/main">
+              <a:graphicData uri="http://schemas.openxmlformats.org/drawingml/2006/picture">
+                <pic:pic xmlns:pic="http://schemas.openxmlformats.org/drawingml/2006/picture">
+                  <pic:nvPicPr>
+                    <pic:cNvPr id="494506925" name=""/>
+                    <pic:cNvPicPr/>
+                  </pic:nvPicPr>
+                  <pic:blipFill>
+                    <a:blip r:embed="rId9"/>
+                    <a:stretch>
+                      <a:fillRect/>
+                    </a:stretch>
+                  </pic:blipFill>
+                  <pic:spPr>
+                    <a:xfrm>
+                      <a:off x="0" y="0"/>
+                      <a:ext cx="6290310" cy="3538220"/>
+                    </a:xfrm>
+                    <a:prstGeom prst="rect">
+                      <a:avLst/>
+                    </a:prstGeom>
+                  </pic:spPr>
+                </pic:pic>
+              </a:graphicData>
+            </a:graphic>
+          </wp:inline>
+        </w:drawing>
+      </w:r>
+    </w:p>
+    <w:p>
+      <w:pPr>
+        <w:pBdr>
+          <w:bottom w:val="single" w:sz="2" w:space="1" w:color="CCCCCC"/>
+        </w:pBdr>
         <w:rPr>
           <w:sz w:val="36"/>
           <w:szCs w:val="36"/>
@@ -408,6 +521,7 @@
       </w:pPr>
       <w:r>
         <w:rPr>
+          <w:noProof/>
           <w:sz w:val="36"/>
           <w:szCs w:val="36"/>
         </w:rPr>
@@ -428,7 +542,7 @@
                     <pic:cNvPicPr/>
                   </pic:nvPicPr>
                   <pic:blipFill>
-                    <a:blip r:embed="rId9"/>
+                    <a:blip r:embed="rId10"/>
                     <a:stretch>
                       <a:fillRect/>
                     </a:stretch>
@@ -497,6 +611,7 @@
       </w:pPr>
       <w:r>
         <w:rPr>
+          <w:noProof/>
           <w:sz w:val="36"/>
           <w:szCs w:val="36"/>
         </w:rPr>
@@ -516,7 +631,7 @@
                     <pic:cNvPicPr/>
                   </pic:nvPicPr>
                   <pic:blipFill>
-                    <a:blip r:embed="rId10"/>
+                    <a:blip r:embed="rId11"/>
                     <a:stretch>
                       <a:fillRect/>
                     </a:stretch>

</xml_diff>

<commit_message>
chore: update image for exercise
</commit_message>
<xml_diff>
--- a/TranTuanHung_23659581_Week_3/TranTuanHung_23659581.docx
+++ b/TranTuanHung_23659581_Week_3/TranTuanHung_23659581.docx
@@ -124,53 +124,106 @@
           <w:sz w:val="36"/>
           <w:szCs w:val="36"/>
         </w:rPr>
-        <w:t>Giờ 1 — Nền tảng Flexbox &amp; Layout đơn giản</w:t>
-      </w:r>
-    </w:p>
-    <w:p>
-      <w:pPr>
-        <w:pBdr>
-          <w:bottom w:val="single" w:sz="2" w:space="1" w:color="CCCCCC"/>
-        </w:pBdr>
-        <w:rPr>
-          <w:b/>
-          <w:bCs/>
-        </w:rPr>
-      </w:pPr>
-    </w:p>
-    <w:p>
-      <w:pPr>
-        <w:pBdr>
-          <w:bottom w:val="single" w:sz="2" w:space="1" w:color="CCCCCC"/>
-        </w:pBdr>
-        <w:rPr>
-          <w:b/>
-          <w:bCs/>
-        </w:rPr>
-      </w:pPr>
-      <w:r>
-        <w:rPr>
-          <w:b/>
-          <w:bCs/>
-        </w:rPr>
-        <w:t>Bài tập 1: Header ứng dụng BookStore  </w:t>
-      </w:r>
-    </w:p>
-    <w:p>
-      <w:pPr>
-        <w:pBdr>
-          <w:bottom w:val="single" w:sz="2" w:space="1" w:color="CCCCCC"/>
-        </w:pBdr>
-      </w:pPr>
-      <w:r>
-        <w:rPr>
-          <w:noProof/>
+        <w:t>Bài tập: </w:t>
+      </w:r>
+    </w:p>
+    <w:p>
+      <w:pPr>
+        <w:pBdr>
+          <w:bottom w:val="single" w:sz="2" w:space="1" w:color="CCCCCC"/>
+        </w:pBdr>
+        <w:rPr>
+          <w:b/>
+          <w:bCs/>
+        </w:rPr>
+      </w:pPr>
+      <w:r>
+        <w:rPr>
+          <w:b/>
+          <w:bCs/>
+        </w:rPr>
+        <w:t>Tổng hợp Giờ 1 + 2 + 3 </w:t>
+      </w:r>
+    </w:p>
+    <w:p>
+      <w:pPr>
+        <w:pBdr>
+          <w:bottom w:val="single" w:sz="2" w:space="1" w:color="CCCCCC"/>
+        </w:pBdr>
+        <w:rPr>
+          <w:b/>
+          <w:bCs/>
+        </w:rPr>
+      </w:pPr>
+      <w:r>
+        <w:rPr>
+          <w:b/>
+          <w:bCs/>
+        </w:rPr>
+        <w:t>**Mục tiêu:** ghép 3 project `gio1`, `gio2`, `gio3` thành **1 màn hình Trang chủ** duy nhất, xếp đúng thứ tự: Header  trên cùng → Category Chips → Lưới sách (có Badge) → Floating Cart Button nổi ở góc. </w:t>
+      </w:r>
+    </w:p>
+    <w:p>
+      <w:pPr>
+        <w:pBdr>
+          <w:bottom w:val="single" w:sz="2" w:space="1" w:color="CCCCCC"/>
+        </w:pBdr>
+        <w:rPr>
+          <w:b/>
+          <w:bCs/>
+        </w:rPr>
+      </w:pPr>
+      <w:r>
+        <w:rPr>
+          <w:b/>
+          <w:bCs/>
+        </w:rPr>
+        <w:t>### Việc cần làm </w:t>
+      </w:r>
+    </w:p>
+    <w:p>
+      <w:pPr>
+        <w:pStyle w:val="ListParagraph"/>
+        <w:numPr>
+          <w:ilvl w:val="0"/>
+          <w:numId w:val="2"/>
+        </w:numPr>
+        <w:pBdr>
+          <w:bottom w:val="single" w:sz="2" w:space="1" w:color="CCCCCC"/>
+        </w:pBdr>
+        <w:rPr>
+          <w:b/>
+          <w:bCs/>
+        </w:rPr>
+      </w:pPr>
+      <w:r>
+        <w:rPr>
+          <w:b/>
+          <w:bCs/>
+        </w:rPr>
+        <w:t>Copy `data.ts` từ 1 trong 3 project bất kỳ (nội dung giống hệt nhau) vào project mới. </w:t>
+      </w:r>
+    </w:p>
+    <w:p>
+      <w:pPr>
+        <w:pBdr>
+          <w:bottom w:val="single" w:sz="2" w:space="1" w:color="CCCCCC"/>
+        </w:pBdr>
+        <w:rPr>
+          <w:b/>
+          <w:bCs/>
+        </w:rPr>
+      </w:pPr>
+      <w:r>
+        <w:rPr>
+          <w:b/>
+          <w:bCs/>
         </w:rPr>
         <w:drawing>
-          <wp:inline distT="0" distB="0" distL="0" distR="0" wp14:anchorId="79965D35" wp14:editId="06E85D2B">
-            <wp:extent cx="6290310" cy="3388995"/>
-            <wp:effectExtent l="0" t="0" r="0" b="1905"/>
-            <wp:docPr id="647320201" name="Picture 1"/>
+          <wp:inline distT="0" distB="0" distL="0" distR="0" wp14:anchorId="1D269950" wp14:editId="1E2A7F2E">
+            <wp:extent cx="6290310" cy="3538220"/>
+            <wp:effectExtent l="0" t="0" r="0" b="5080"/>
+            <wp:docPr id="874646829" name="Picture 1"/>
             <wp:cNvGraphicFramePr>
               <a:graphicFrameLocks xmlns:a="http://schemas.openxmlformats.org/drawingml/2006/main" noChangeAspect="1"/>
             </wp:cNvGraphicFramePr>
@@ -178,7 +231,7 @@
               <a:graphicData uri="http://schemas.openxmlformats.org/drawingml/2006/picture">
                 <pic:pic xmlns:pic="http://schemas.openxmlformats.org/drawingml/2006/picture">
                   <pic:nvPicPr>
-                    <pic:cNvPr id="647320201" name=""/>
+                    <pic:cNvPr id="874646829" name=""/>
                     <pic:cNvPicPr/>
                   </pic:nvPicPr>
                   <pic:blipFill>
@@ -190,7 +243,7 @@
                   <pic:spPr>
                     <a:xfrm>
                       <a:off x="0" y="0"/>
-                      <a:ext cx="6290310" cy="3388995"/>
+                      <a:ext cx="6290310" cy="3538220"/>
                     </a:xfrm>
                     <a:prstGeom prst="rect">
                       <a:avLst/>
@@ -208,48 +261,54 @@
         <w:pBdr>
           <w:bottom w:val="single" w:sz="2" w:space="1" w:color="CCCCCC"/>
         </w:pBdr>
-      </w:pPr>
-    </w:p>
-    <w:p>
-      <w:pPr>
-        <w:pBdr>
-          <w:bottom w:val="single" w:sz="2" w:space="1" w:color="CCCCCC"/>
-        </w:pBdr>
-      </w:pPr>
-    </w:p>
-    <w:p>
-      <w:pPr>
-        <w:pBdr>
-          <w:bottom w:val="single" w:sz="2" w:space="1" w:color="CCCCCC"/>
-        </w:pBdr>
-        <w:rPr>
-          <w:b/>
-          <w:bCs/>
-        </w:rPr>
-      </w:pPr>
-      <w:r>
-        <w:rPr>
-          <w:b/>
-          <w:bCs/>
-        </w:rPr>
-        <w:t>Bài tập 2: Thẻ sách (Book Card) đơn</w:t>
-      </w:r>
-    </w:p>
-    <w:p>
-      <w:pPr>
-        <w:pBdr>
-          <w:bottom w:val="single" w:sz="2" w:space="1" w:color="CCCCCC"/>
-        </w:pBdr>
-      </w:pPr>
-      <w:r>
-        <w:rPr>
-          <w:noProof/>
+        <w:rPr>
+          <w:b/>
+          <w:bCs/>
+          <w:sz w:val="36"/>
+          <w:szCs w:val="36"/>
+        </w:rPr>
+      </w:pPr>
+      <w:r>
+        <w:rPr>
+          <w:b/>
+          <w:bCs/>
+        </w:rPr>
+        <w:t>2. Copy 5 file component, **giữ nguyên không sửa gì**:</w:t>
+      </w:r>
+      <w:r>
+        <w:rPr>
+          <w:b/>
+          <w:bCs/>
+          <w:sz w:val="36"/>
+          <w:szCs w:val="36"/>
+        </w:rPr>
+        <w:t> </w:t>
+      </w:r>
+    </w:p>
+    <w:p>
+      <w:pPr>
+        <w:pBdr>
+          <w:bottom w:val="single" w:sz="2" w:space="1" w:color="CCCCCC"/>
+        </w:pBdr>
+        <w:rPr>
+          <w:b/>
+          <w:bCs/>
+          <w:sz w:val="36"/>
+          <w:szCs w:val="36"/>
+        </w:rPr>
+      </w:pPr>
+      <w:r>
+        <w:rPr>
+          <w:b/>
+          <w:bCs/>
+          <w:sz w:val="36"/>
+          <w:szCs w:val="36"/>
         </w:rPr>
         <w:drawing>
-          <wp:inline distT="0" distB="0" distL="0" distR="0" wp14:anchorId="6D412EB4" wp14:editId="2BF42BA1">
-            <wp:extent cx="6290310" cy="3211830"/>
-            <wp:effectExtent l="0" t="0" r="0" b="7620"/>
-            <wp:docPr id="779595259" name="Picture 1"/>
+          <wp:inline distT="0" distB="0" distL="0" distR="0" wp14:anchorId="6BB05D2E" wp14:editId="670FED10">
+            <wp:extent cx="6290310" cy="3538220"/>
+            <wp:effectExtent l="0" t="0" r="0" b="5080"/>
+            <wp:docPr id="1430597820" name="Picture 1"/>
             <wp:cNvGraphicFramePr>
               <a:graphicFrameLocks xmlns:a="http://schemas.openxmlformats.org/drawingml/2006/main" noChangeAspect="1"/>
             </wp:cNvGraphicFramePr>
@@ -257,7 +316,7 @@
               <a:graphicData uri="http://schemas.openxmlformats.org/drawingml/2006/picture">
                 <pic:pic xmlns:pic="http://schemas.openxmlformats.org/drawingml/2006/picture">
                   <pic:nvPicPr>
-                    <pic:cNvPr id="779595259" name=""/>
+                    <pic:cNvPr id="1430597820" name=""/>
                     <pic:cNvPicPr/>
                   </pic:nvPicPr>
                   <pic:blipFill>
@@ -269,7 +328,7 @@
                   <pic:spPr>
                     <a:xfrm>
                       <a:off x="0" y="0"/>
-                      <a:ext cx="6290310" cy="3211830"/>
+                      <a:ext cx="6290310" cy="3538220"/>
                     </a:xfrm>
                     <a:prstGeom prst="rect">
                       <a:avLst/>
@@ -292,63 +351,39 @@
           <w:bCs/>
         </w:rPr>
       </w:pPr>
-    </w:p>
-    <w:p>
-      <w:pPr>
-        <w:pBdr>
-          <w:bottom w:val="single" w:sz="2" w:space="1" w:color="CCCCCC"/>
-        </w:pBdr>
-        <w:rPr>
-          <w:b/>
-          <w:bCs/>
-          <w:sz w:val="36"/>
-          <w:szCs w:val="36"/>
-        </w:rPr>
-      </w:pPr>
-      <w:r>
-        <w:rPr>
-          <w:b/>
-          <w:bCs/>
-          <w:sz w:val="36"/>
-          <w:szCs w:val="36"/>
-        </w:rPr>
-        <w:t>Giờ 2 — Kích thước, Wrap và Lưới sản phẩm (Grid)</w:t>
-      </w:r>
-    </w:p>
-    <w:p>
-      <w:pPr>
-        <w:pBdr>
-          <w:bottom w:val="single" w:sz="2" w:space="1" w:color="CCCCCC"/>
-        </w:pBdr>
-        <w:rPr>
-          <w:b/>
-          <w:bCs/>
-        </w:rPr>
-      </w:pPr>
-      <w:r>
-        <w:rPr>
-          <w:b/>
-          <w:bCs/>
-        </w:rPr>
-        <w:t>Bài tập 1: Danh sách danh mục dạng chip (Category Chips) </w:t>
-      </w:r>
-    </w:p>
-    <w:p>
-      <w:pPr>
-        <w:pBdr>
-          <w:bottom w:val="single" w:sz="2" w:space="1" w:color="CCCCCC"/>
-        </w:pBdr>
-      </w:pPr>
-      <w:r>
-        <w:rPr>
-          <w:noProof/>
+      <w:r>
+        <w:rPr>
+          <w:b/>
+          <w:bCs/>
         </w:rPr>
         <w:lastRenderedPageBreak/>
+        <w:t>3. Viết `App.tsx` mới, ráp theo đúng khung sau (điền phần `...`): </w:t>
+      </w:r>
+    </w:p>
+    <w:p>
+      <w:pPr>
+        <w:pBdr>
+          <w:bottom w:val="single" w:sz="2" w:space="1" w:color="CCCCCC"/>
+        </w:pBdr>
+        <w:rPr>
+          <w:b/>
+          <w:bCs/>
+          <w:sz w:val="36"/>
+          <w:szCs w:val="36"/>
+        </w:rPr>
+      </w:pPr>
+      <w:r>
+        <w:rPr>
+          <w:b/>
+          <w:bCs/>
+          <w:sz w:val="36"/>
+          <w:szCs w:val="36"/>
+        </w:rPr>
         <w:drawing>
-          <wp:inline distT="0" distB="0" distL="0" distR="0" wp14:anchorId="01484A60" wp14:editId="189DA064">
+          <wp:inline distT="0" distB="0" distL="0" distR="0" wp14:anchorId="28EB5EAF" wp14:editId="07909271">
             <wp:extent cx="6290310" cy="3538220"/>
             <wp:effectExtent l="0" t="0" r="0" b="5080"/>
-            <wp:docPr id="1386162492" name="Picture 1"/>
+            <wp:docPr id="443042115" name="Picture 1"/>
             <wp:cNvGraphicFramePr>
               <a:graphicFrameLocks xmlns:a="http://schemas.openxmlformats.org/drawingml/2006/main" noChangeAspect="1"/>
             </wp:cNvGraphicFramePr>
@@ -356,7 +391,7 @@
               <a:graphicData uri="http://schemas.openxmlformats.org/drawingml/2006/picture">
                 <pic:pic xmlns:pic="http://schemas.openxmlformats.org/drawingml/2006/picture">
                   <pic:nvPicPr>
-                    <pic:cNvPr id="1386162492" name=""/>
+                    <pic:cNvPr id="443042115" name=""/>
                     <pic:cNvPicPr/>
                   </pic:nvPicPr>
                   <pic:blipFill>
@@ -386,50 +421,516 @@
         <w:pBdr>
           <w:bottom w:val="single" w:sz="2" w:space="1" w:color="CCCCCC"/>
         </w:pBdr>
-      </w:pPr>
-    </w:p>
-    <w:p>
-      <w:pPr>
-        <w:pBdr>
-          <w:bottom w:val="single" w:sz="2" w:space="1" w:color="CCCCCC"/>
-        </w:pBdr>
-      </w:pPr>
-    </w:p>
-    <w:p>
-      <w:pPr>
-        <w:pBdr>
-          <w:bottom w:val="single" w:sz="2" w:space="1" w:color="CCCCCC"/>
-        </w:pBdr>
-      </w:pPr>
-      <w:r>
-        <w:rPr>
-          <w:b/>
-          <w:bCs/>
-        </w:rPr>
-        <w:t>Bài tập 2: Lưới sản phẩm 2 cột (Book Grid)</w:t>
-      </w:r>
-    </w:p>
-    <w:p>
-      <w:pPr>
-        <w:pBdr>
-          <w:bottom w:val="single" w:sz="2" w:space="1" w:color="CCCCCC"/>
-        </w:pBdr>
-        <w:rPr>
-          <w:sz w:val="36"/>
-          <w:szCs w:val="36"/>
-        </w:rPr>
-      </w:pPr>
-      <w:r>
-        <w:rPr>
-          <w:noProof/>
-          <w:sz w:val="36"/>
-          <w:szCs w:val="36"/>
+        <w:rPr>
+          <w:b/>
+          <w:bCs/>
+        </w:rPr>
+      </w:pPr>
+    </w:p>
+    <w:p>
+      <w:pPr>
+        <w:pBdr>
+          <w:bottom w:val="single" w:sz="2" w:space="1" w:color="CCCCCC"/>
+        </w:pBdr>
+        <w:rPr>
+          <w:b/>
+          <w:bCs/>
+        </w:rPr>
+      </w:pPr>
+    </w:p>
+    <w:p>
+      <w:pPr>
+        <w:pBdr>
+          <w:bottom w:val="single" w:sz="2" w:space="1" w:color="CCCCCC"/>
+        </w:pBdr>
+        <w:rPr>
+          <w:b/>
+          <w:bCs/>
+        </w:rPr>
+      </w:pPr>
+    </w:p>
+    <w:p>
+      <w:pPr>
+        <w:pBdr>
+          <w:bottom w:val="single" w:sz="2" w:space="1" w:color="CCCCCC"/>
+        </w:pBdr>
+        <w:rPr>
+          <w:b/>
+          <w:bCs/>
+        </w:rPr>
+      </w:pPr>
+    </w:p>
+    <w:p>
+      <w:pPr>
+        <w:pBdr>
+          <w:bottom w:val="single" w:sz="2" w:space="1" w:color="CCCCCC"/>
+        </w:pBdr>
+        <w:rPr>
+          <w:b/>
+          <w:bCs/>
+        </w:rPr>
+      </w:pPr>
+    </w:p>
+    <w:p>
+      <w:pPr>
+        <w:pBdr>
+          <w:bottom w:val="single" w:sz="2" w:space="1" w:color="CCCCCC"/>
+        </w:pBdr>
+        <w:rPr>
+          <w:b/>
+          <w:bCs/>
+        </w:rPr>
+      </w:pPr>
+    </w:p>
+    <w:p>
+      <w:pPr>
+        <w:pBdr>
+          <w:bottom w:val="single" w:sz="2" w:space="1" w:color="CCCCCC"/>
+        </w:pBdr>
+        <w:rPr>
+          <w:b/>
+          <w:bCs/>
+        </w:rPr>
+      </w:pPr>
+    </w:p>
+    <w:p>
+      <w:pPr>
+        <w:pBdr>
+          <w:bottom w:val="single" w:sz="2" w:space="1" w:color="CCCCCC"/>
+        </w:pBdr>
+        <w:rPr>
+          <w:b/>
+          <w:bCs/>
+        </w:rPr>
+      </w:pPr>
+    </w:p>
+    <w:p>
+      <w:pPr>
+        <w:pBdr>
+          <w:bottom w:val="single" w:sz="2" w:space="1" w:color="CCCCCC"/>
+        </w:pBdr>
+        <w:rPr>
+          <w:b/>
+          <w:bCs/>
+        </w:rPr>
+      </w:pPr>
+    </w:p>
+    <w:p>
+      <w:pPr>
+        <w:pBdr>
+          <w:bottom w:val="single" w:sz="2" w:space="1" w:color="CCCCCC"/>
+        </w:pBdr>
+        <w:rPr>
+          <w:b/>
+          <w:bCs/>
+        </w:rPr>
+      </w:pPr>
+    </w:p>
+    <w:p>
+      <w:pPr>
+        <w:pBdr>
+          <w:bottom w:val="single" w:sz="2" w:space="1" w:color="CCCCCC"/>
+        </w:pBdr>
+        <w:rPr>
+          <w:b/>
+          <w:bCs/>
+        </w:rPr>
+      </w:pPr>
+    </w:p>
+    <w:p>
+      <w:pPr>
+        <w:pBdr>
+          <w:bottom w:val="single" w:sz="2" w:space="1" w:color="CCCCCC"/>
+        </w:pBdr>
+        <w:rPr>
+          <w:b/>
+          <w:bCs/>
+        </w:rPr>
+      </w:pPr>
+    </w:p>
+    <w:p>
+      <w:pPr>
+        <w:pBdr>
+          <w:bottom w:val="single" w:sz="2" w:space="1" w:color="CCCCCC"/>
+        </w:pBdr>
+        <w:rPr>
+          <w:b/>
+          <w:bCs/>
+        </w:rPr>
+      </w:pPr>
+    </w:p>
+    <w:p>
+      <w:pPr>
+        <w:pBdr>
+          <w:bottom w:val="single" w:sz="2" w:space="1" w:color="CCCCCC"/>
+        </w:pBdr>
+        <w:rPr>
+          <w:b/>
+          <w:bCs/>
+        </w:rPr>
+      </w:pPr>
+    </w:p>
+    <w:p>
+      <w:pPr>
+        <w:pBdr>
+          <w:bottom w:val="single" w:sz="2" w:space="1" w:color="CCCCCC"/>
+        </w:pBdr>
+        <w:rPr>
+          <w:b/>
+          <w:bCs/>
+        </w:rPr>
+      </w:pPr>
+    </w:p>
+    <w:p>
+      <w:pPr>
+        <w:pBdr>
+          <w:bottom w:val="single" w:sz="2" w:space="1" w:color="CCCCCC"/>
+        </w:pBdr>
+        <w:rPr>
+          <w:b/>
+          <w:bCs/>
+        </w:rPr>
+      </w:pPr>
+    </w:p>
+    <w:p>
+      <w:pPr>
+        <w:pBdr>
+          <w:bottom w:val="single" w:sz="2" w:space="1" w:color="CCCCCC"/>
+        </w:pBdr>
+        <w:rPr>
+          <w:b/>
+          <w:bCs/>
+        </w:rPr>
+      </w:pPr>
+    </w:p>
+    <w:p>
+      <w:pPr>
+        <w:pBdr>
+          <w:bottom w:val="single" w:sz="2" w:space="1" w:color="CCCCCC"/>
+        </w:pBdr>
+        <w:rPr>
+          <w:b/>
+          <w:bCs/>
+        </w:rPr>
+      </w:pPr>
+    </w:p>
+    <w:p>
+      <w:pPr>
+        <w:pBdr>
+          <w:bottom w:val="single" w:sz="2" w:space="1" w:color="CCCCCC"/>
+        </w:pBdr>
+        <w:rPr>
+          <w:b/>
+          <w:bCs/>
+        </w:rPr>
+      </w:pPr>
+    </w:p>
+    <w:p>
+      <w:pPr>
+        <w:pBdr>
+          <w:bottom w:val="single" w:sz="2" w:space="1" w:color="CCCCCC"/>
+        </w:pBdr>
+        <w:rPr>
+          <w:b/>
+          <w:bCs/>
+        </w:rPr>
+      </w:pPr>
+    </w:p>
+    <w:p>
+      <w:pPr>
+        <w:pBdr>
+          <w:bottom w:val="single" w:sz="2" w:space="1" w:color="CCCCCC"/>
+        </w:pBdr>
+        <w:rPr>
+          <w:b/>
+          <w:bCs/>
+        </w:rPr>
+      </w:pPr>
+    </w:p>
+    <w:p>
+      <w:pPr>
+        <w:pBdr>
+          <w:bottom w:val="single" w:sz="2" w:space="1" w:color="CCCCCC"/>
+        </w:pBdr>
+        <w:rPr>
+          <w:b/>
+          <w:bCs/>
+        </w:rPr>
+      </w:pPr>
+    </w:p>
+    <w:p>
+      <w:pPr>
+        <w:pBdr>
+          <w:bottom w:val="single" w:sz="2" w:space="1" w:color="CCCCCC"/>
+        </w:pBdr>
+        <w:rPr>
+          <w:b/>
+          <w:bCs/>
+        </w:rPr>
+      </w:pPr>
+    </w:p>
+    <w:p>
+      <w:pPr>
+        <w:pBdr>
+          <w:bottom w:val="single" w:sz="2" w:space="1" w:color="CCCCCC"/>
+        </w:pBdr>
+        <w:rPr>
+          <w:b/>
+          <w:bCs/>
+        </w:rPr>
+      </w:pPr>
+    </w:p>
+    <w:p>
+      <w:pPr>
+        <w:pBdr>
+          <w:bottom w:val="single" w:sz="2" w:space="1" w:color="CCCCCC"/>
+        </w:pBdr>
+        <w:rPr>
+          <w:b/>
+          <w:bCs/>
+        </w:rPr>
+      </w:pPr>
+    </w:p>
+    <w:p>
+      <w:pPr>
+        <w:pBdr>
+          <w:bottom w:val="single" w:sz="2" w:space="1" w:color="CCCCCC"/>
+        </w:pBdr>
+        <w:rPr>
+          <w:b/>
+          <w:bCs/>
+        </w:rPr>
+      </w:pPr>
+    </w:p>
+    <w:p>
+      <w:pPr>
+        <w:pBdr>
+          <w:bottom w:val="single" w:sz="2" w:space="1" w:color="CCCCCC"/>
+        </w:pBdr>
+        <w:rPr>
+          <w:b/>
+          <w:bCs/>
+        </w:rPr>
+      </w:pPr>
+    </w:p>
+    <w:p>
+      <w:pPr>
+        <w:pBdr>
+          <w:bottom w:val="single" w:sz="2" w:space="1" w:color="CCCCCC"/>
+        </w:pBdr>
+        <w:rPr>
+          <w:b/>
+          <w:bCs/>
+        </w:rPr>
+      </w:pPr>
+    </w:p>
+    <w:p>
+      <w:pPr>
+        <w:pBdr>
+          <w:bottom w:val="single" w:sz="2" w:space="1" w:color="CCCCCC"/>
+        </w:pBdr>
+        <w:rPr>
+          <w:b/>
+          <w:bCs/>
+        </w:rPr>
+      </w:pPr>
+    </w:p>
+    <w:p>
+      <w:pPr>
+        <w:pBdr>
+          <w:bottom w:val="single" w:sz="2" w:space="1" w:color="CCCCCC"/>
+        </w:pBdr>
+        <w:rPr>
+          <w:b/>
+          <w:bCs/>
+        </w:rPr>
+      </w:pPr>
+    </w:p>
+    <w:p>
+      <w:pPr>
+        <w:pBdr>
+          <w:bottom w:val="single" w:sz="2" w:space="1" w:color="CCCCCC"/>
+        </w:pBdr>
+        <w:rPr>
+          <w:b/>
+          <w:bCs/>
+        </w:rPr>
+      </w:pPr>
+    </w:p>
+    <w:p>
+      <w:pPr>
+        <w:pBdr>
+          <w:bottom w:val="single" w:sz="2" w:space="1" w:color="CCCCCC"/>
+        </w:pBdr>
+        <w:rPr>
+          <w:b/>
+          <w:bCs/>
+        </w:rPr>
+      </w:pPr>
+    </w:p>
+    <w:p>
+      <w:pPr>
+        <w:pBdr>
+          <w:bottom w:val="single" w:sz="2" w:space="1" w:color="CCCCCC"/>
+        </w:pBdr>
+        <w:rPr>
+          <w:b/>
+          <w:bCs/>
+        </w:rPr>
+      </w:pPr>
+    </w:p>
+    <w:p>
+      <w:pPr>
+        <w:pBdr>
+          <w:bottom w:val="single" w:sz="2" w:space="1" w:color="CCCCCC"/>
+        </w:pBdr>
+        <w:rPr>
+          <w:b/>
+          <w:bCs/>
+        </w:rPr>
+      </w:pPr>
+    </w:p>
+    <w:p>
+      <w:pPr>
+        <w:pBdr>
+          <w:bottom w:val="single" w:sz="2" w:space="1" w:color="CCCCCC"/>
+        </w:pBdr>
+        <w:rPr>
+          <w:b/>
+          <w:bCs/>
+        </w:rPr>
+      </w:pPr>
+    </w:p>
+    <w:p>
+      <w:pPr>
+        <w:pBdr>
+          <w:bottom w:val="single" w:sz="2" w:space="1" w:color="CCCCCC"/>
+        </w:pBdr>
+        <w:rPr>
+          <w:b/>
+          <w:bCs/>
+        </w:rPr>
+      </w:pPr>
+    </w:p>
+    <w:p>
+      <w:pPr>
+        <w:pBdr>
+          <w:bottom w:val="single" w:sz="2" w:space="1" w:color="CCCCCC"/>
+        </w:pBdr>
+        <w:rPr>
+          <w:b/>
+          <w:bCs/>
+        </w:rPr>
+      </w:pPr>
+    </w:p>
+    <w:p>
+      <w:pPr>
+        <w:pBdr>
+          <w:bottom w:val="single" w:sz="2" w:space="1" w:color="CCCCCC"/>
+        </w:pBdr>
+        <w:rPr>
+          <w:b/>
+          <w:bCs/>
+        </w:rPr>
+      </w:pPr>
+    </w:p>
+    <w:p>
+      <w:pPr>
+        <w:pBdr>
+          <w:bottom w:val="single" w:sz="2" w:space="1" w:color="CCCCCC"/>
+        </w:pBdr>
+        <w:rPr>
+          <w:b/>
+          <w:bCs/>
+        </w:rPr>
+      </w:pPr>
+    </w:p>
+    <w:p>
+      <w:pPr>
+        <w:pBdr>
+          <w:bottom w:val="single" w:sz="2" w:space="1" w:color="CCCCCC"/>
+        </w:pBdr>
+        <w:rPr>
+          <w:b/>
+          <w:bCs/>
+        </w:rPr>
+      </w:pPr>
+      <w:r>
+        <w:rPr>
+          <w:b/>
+          <w:bCs/>
+        </w:rPr>
+        <w:lastRenderedPageBreak/>
+        <w:t>- [ ] Cuộn danh sách sách xuống, Header **đứng yên**, không cuộn theo. </w:t>
+      </w:r>
+    </w:p>
+    <w:p>
+      <w:pPr>
+        <w:pBdr>
+          <w:bottom w:val="single" w:sz="2" w:space="1" w:color="CCCCCC"/>
+        </w:pBdr>
+        <w:rPr>
+          <w:b/>
+          <w:bCs/>
+        </w:rPr>
+      </w:pPr>
+      <w:r>
+        <w:rPr>
+          <w:b/>
+          <w:bCs/>
+        </w:rPr>
+        <w:t>- [ ] Nút giỏ hàng tròn luôn nổi ở góc, không bị cuộn trôi mất. </w:t>
+      </w:r>
+    </w:p>
+    <w:p>
+      <w:pPr>
+        <w:pBdr>
+          <w:bottom w:val="single" w:sz="2" w:space="1" w:color="CCCCCC"/>
+        </w:pBdr>
+        <w:rPr>
+          <w:b/>
+          <w:bCs/>
+        </w:rPr>
+      </w:pPr>
+      <w:r>
+        <w:rPr>
+          <w:b/>
+          <w:bCs/>
+        </w:rPr>
+        <w:t>- [ ] Mỗi ô sách có đúng badge `-x%` hoặc `Mới` dính sát góc ảnh (không lệch). </w:t>
+      </w:r>
+    </w:p>
+    <w:p>
+      <w:pPr>
+        <w:pBdr>
+          <w:bottom w:val="single" w:sz="2" w:space="1" w:color="CCCCCC"/>
+        </w:pBdr>
+        <w:rPr>
+          <w:b/>
+          <w:bCs/>
+        </w:rPr>
+      </w:pPr>
+    </w:p>
+    <w:p>
+      <w:pPr>
+        <w:pBdr>
+          <w:bottom w:val="single" w:sz="2" w:space="1" w:color="CCCCCC"/>
+        </w:pBdr>
+        <w:rPr>
+          <w:b/>
+          <w:bCs/>
+        </w:rPr>
+      </w:pPr>
+      <w:r>
+        <w:rPr>
+          <w:b/>
+          <w:bCs/>
         </w:rPr>
         <w:drawing>
-          <wp:inline distT="0" distB="0" distL="0" distR="0" wp14:anchorId="2443FE59" wp14:editId="45240EB2">
-            <wp:extent cx="6290310" cy="3538220"/>
-            <wp:effectExtent l="0" t="0" r="0" b="5080"/>
-            <wp:docPr id="494506925" name="Picture 1"/>
+          <wp:inline distT="0" distB="0" distL="0" distR="0" wp14:anchorId="56035738" wp14:editId="0334FFCA">
+            <wp:extent cx="6290310" cy="5650865"/>
+            <wp:effectExtent l="0" t="0" r="0" b="6985"/>
+            <wp:docPr id="1785890029" name="Picture 1"/>
             <wp:cNvGraphicFramePr>
               <a:graphicFrameLocks xmlns:a="http://schemas.openxmlformats.org/drawingml/2006/main" noChangeAspect="1"/>
             </wp:cNvGraphicFramePr>
@@ -437,11 +938,242 @@
               <a:graphicData uri="http://schemas.openxmlformats.org/drawingml/2006/picture">
                 <pic:pic xmlns:pic="http://schemas.openxmlformats.org/drawingml/2006/picture">
                   <pic:nvPicPr>
-                    <pic:cNvPr id="494506925" name=""/>
+                    <pic:cNvPr id="1785890029" name=""/>
                     <pic:cNvPicPr/>
                   </pic:nvPicPr>
                   <pic:blipFill>
                     <a:blip r:embed="rId9"/>
+                    <a:stretch>
+                      <a:fillRect/>
+                    </a:stretch>
+                  </pic:blipFill>
+                  <pic:spPr>
+                    <a:xfrm>
+                      <a:off x="0" y="0"/>
+                      <a:ext cx="6290310" cy="5650865"/>
+                    </a:xfrm>
+                    <a:prstGeom prst="rect">
+                      <a:avLst/>
+                    </a:prstGeom>
+                  </pic:spPr>
+                </pic:pic>
+              </a:graphicData>
+            </a:graphic>
+          </wp:inline>
+        </w:drawing>
+      </w:r>
+    </w:p>
+    <w:p>
+      <w:pPr>
+        <w:pBdr>
+          <w:bottom w:val="single" w:sz="2" w:space="1" w:color="CCCCCC"/>
+        </w:pBdr>
+        <w:rPr>
+          <w:b/>
+          <w:bCs/>
+          <w:sz w:val="36"/>
+          <w:szCs w:val="36"/>
+        </w:rPr>
+      </w:pPr>
+    </w:p>
+    <w:p>
+      <w:pPr>
+        <w:pBdr>
+          <w:bottom w:val="single" w:sz="2" w:space="1" w:color="CCCCCC"/>
+        </w:pBdr>
+        <w:rPr>
+          <w:b/>
+          <w:bCs/>
+          <w:sz w:val="36"/>
+          <w:szCs w:val="36"/>
+        </w:rPr>
+      </w:pPr>
+    </w:p>
+    <w:p>
+      <w:pPr>
+        <w:pBdr>
+          <w:bottom w:val="single" w:sz="2" w:space="1" w:color="CCCCCC"/>
+        </w:pBdr>
+        <w:rPr>
+          <w:b/>
+          <w:bCs/>
+          <w:sz w:val="36"/>
+          <w:szCs w:val="36"/>
+        </w:rPr>
+      </w:pPr>
+    </w:p>
+    <w:p>
+      <w:pPr>
+        <w:pBdr>
+          <w:bottom w:val="single" w:sz="2" w:space="1" w:color="CCCCCC"/>
+        </w:pBdr>
+        <w:rPr>
+          <w:b/>
+          <w:bCs/>
+          <w:sz w:val="36"/>
+          <w:szCs w:val="36"/>
+        </w:rPr>
+      </w:pPr>
+    </w:p>
+    <w:p>
+      <w:pPr>
+        <w:pBdr>
+          <w:bottom w:val="single" w:sz="2" w:space="1" w:color="CCCCCC"/>
+        </w:pBdr>
+        <w:rPr>
+          <w:b/>
+          <w:bCs/>
+          <w:sz w:val="36"/>
+          <w:szCs w:val="36"/>
+        </w:rPr>
+      </w:pPr>
+    </w:p>
+    <w:p>
+      <w:pPr>
+        <w:pBdr>
+          <w:bottom w:val="single" w:sz="2" w:space="1" w:color="CCCCCC"/>
+        </w:pBdr>
+        <w:rPr>
+          <w:b/>
+          <w:bCs/>
+          <w:sz w:val="36"/>
+          <w:szCs w:val="36"/>
+        </w:rPr>
+      </w:pPr>
+    </w:p>
+    <w:p>
+      <w:pPr>
+        <w:pBdr>
+          <w:bottom w:val="single" w:sz="2" w:space="1" w:color="CCCCCC"/>
+        </w:pBdr>
+        <w:rPr>
+          <w:b/>
+          <w:bCs/>
+          <w:sz w:val="36"/>
+          <w:szCs w:val="36"/>
+        </w:rPr>
+      </w:pPr>
+    </w:p>
+    <w:p>
+      <w:pPr>
+        <w:pBdr>
+          <w:bottom w:val="single" w:sz="2" w:space="1" w:color="CCCCCC"/>
+        </w:pBdr>
+        <w:rPr>
+          <w:b/>
+          <w:bCs/>
+          <w:sz w:val="36"/>
+          <w:szCs w:val="36"/>
+        </w:rPr>
+      </w:pPr>
+    </w:p>
+    <w:p>
+      <w:pPr>
+        <w:pBdr>
+          <w:bottom w:val="single" w:sz="2" w:space="1" w:color="CCCCCC"/>
+        </w:pBdr>
+        <w:rPr>
+          <w:b/>
+          <w:bCs/>
+          <w:sz w:val="36"/>
+          <w:szCs w:val="36"/>
+        </w:rPr>
+      </w:pPr>
+    </w:p>
+    <w:p>
+      <w:pPr>
+        <w:pBdr>
+          <w:bottom w:val="single" w:sz="2" w:space="1" w:color="CCCCCC"/>
+        </w:pBdr>
+        <w:rPr>
+          <w:b/>
+          <w:bCs/>
+          <w:sz w:val="36"/>
+          <w:szCs w:val="36"/>
+        </w:rPr>
+      </w:pPr>
+    </w:p>
+    <w:p>
+      <w:pPr>
+        <w:pBdr>
+          <w:bottom w:val="single" w:sz="2" w:space="1" w:color="CCCCCC"/>
+        </w:pBdr>
+        <w:rPr>
+          <w:b/>
+          <w:bCs/>
+          <w:sz w:val="36"/>
+          <w:szCs w:val="36"/>
+        </w:rPr>
+      </w:pPr>
+    </w:p>
+    <w:p>
+      <w:pPr>
+        <w:pBdr>
+          <w:bottom w:val="single" w:sz="2" w:space="1" w:color="CCCCCC"/>
+        </w:pBdr>
+        <w:rPr>
+          <w:b/>
+          <w:bCs/>
+          <w:sz w:val="36"/>
+          <w:szCs w:val="36"/>
+        </w:rPr>
+      </w:pPr>
+    </w:p>
+    <w:p>
+      <w:pPr>
+        <w:pBdr>
+          <w:bottom w:val="single" w:sz="2" w:space="1" w:color="CCCCCC"/>
+        </w:pBdr>
+        <w:rPr>
+          <w:b/>
+          <w:bCs/>
+        </w:rPr>
+      </w:pPr>
+      <w:r>
+        <w:rPr>
+          <w:b/>
+          <w:bCs/>
+        </w:rPr>
+        <w:lastRenderedPageBreak/>
+        <w:t>- [ ] `npx tsc --noEmit` không báo lỗi nào.</w:t>
+      </w:r>
+    </w:p>
+    <w:p>
+      <w:pPr>
+        <w:pBdr>
+          <w:bottom w:val="single" w:sz="2" w:space="1" w:color="CCCCCC"/>
+        </w:pBdr>
+        <w:rPr>
+          <w:b/>
+          <w:bCs/>
+          <w:sz w:val="36"/>
+          <w:szCs w:val="36"/>
+        </w:rPr>
+      </w:pPr>
+      <w:r>
+        <w:rPr>
+          <w:b/>
+          <w:bCs/>
+          <w:sz w:val="36"/>
+          <w:szCs w:val="36"/>
+        </w:rPr>
+        <w:drawing>
+          <wp:inline distT="0" distB="0" distL="0" distR="0" wp14:anchorId="564DA4D0" wp14:editId="2988809E">
+            <wp:extent cx="6290310" cy="3538220"/>
+            <wp:effectExtent l="0" t="0" r="0" b="5080"/>
+            <wp:docPr id="203782455" name="Picture 1"/>
+            <wp:cNvGraphicFramePr>
+              <a:graphicFrameLocks xmlns:a="http://schemas.openxmlformats.org/drawingml/2006/main" noChangeAspect="1"/>
+            </wp:cNvGraphicFramePr>
+            <a:graphic xmlns:a="http://schemas.openxmlformats.org/drawingml/2006/main">
+              <a:graphicData uri="http://schemas.openxmlformats.org/drawingml/2006/picture">
+                <pic:pic xmlns:pic="http://schemas.openxmlformats.org/drawingml/2006/picture">
+                  <pic:nvPicPr>
+                    <pic:cNvPr id="203782455" name=""/>
+                    <pic:cNvPicPr/>
+                  </pic:nvPicPr>
+                  <pic:blipFill>
+                    <a:blip r:embed="rId10"/>
                     <a:stretch>
                       <a:fillRect/>
                     </a:stretch>
@@ -468,6 +1200,377 @@
           <w:bottom w:val="single" w:sz="2" w:space="1" w:color="CCCCCC"/>
         </w:pBdr>
         <w:rPr>
+          <w:b/>
+          <w:bCs/>
+          <w:sz w:val="36"/>
+          <w:szCs w:val="36"/>
+        </w:rPr>
+      </w:pPr>
+    </w:p>
+    <w:p>
+      <w:pPr>
+        <w:pBdr>
+          <w:bottom w:val="single" w:sz="2" w:space="1" w:color="CCCCCC"/>
+        </w:pBdr>
+        <w:rPr>
+          <w:b/>
+          <w:bCs/>
+          <w:sz w:val="36"/>
+          <w:szCs w:val="36"/>
+        </w:rPr>
+      </w:pPr>
+      <w:r>
+        <w:rPr>
+          <w:b/>
+          <w:bCs/>
+          <w:sz w:val="36"/>
+          <w:szCs w:val="36"/>
+        </w:rPr>
+        <w:t>Giờ 1 — Nền tảng Flexbox &amp; Layout đơn giản</w:t>
+      </w:r>
+    </w:p>
+    <w:p>
+      <w:pPr>
+        <w:pBdr>
+          <w:bottom w:val="single" w:sz="2" w:space="1" w:color="CCCCCC"/>
+        </w:pBdr>
+        <w:rPr>
+          <w:b/>
+          <w:bCs/>
+        </w:rPr>
+      </w:pPr>
+    </w:p>
+    <w:p>
+      <w:pPr>
+        <w:pBdr>
+          <w:bottom w:val="single" w:sz="2" w:space="1" w:color="CCCCCC"/>
+        </w:pBdr>
+        <w:rPr>
+          <w:b/>
+          <w:bCs/>
+        </w:rPr>
+      </w:pPr>
+      <w:r>
+        <w:rPr>
+          <w:b/>
+          <w:bCs/>
+        </w:rPr>
+        <w:t>Bài tập 1: Header ứng dụng BookStore  </w:t>
+      </w:r>
+    </w:p>
+    <w:p>
+      <w:pPr>
+        <w:pBdr>
+          <w:bottom w:val="single" w:sz="2" w:space="1" w:color="CCCCCC"/>
+        </w:pBdr>
+      </w:pPr>
+      <w:r>
+        <w:rPr>
+          <w:noProof/>
+        </w:rPr>
+        <w:drawing>
+          <wp:inline distT="0" distB="0" distL="0" distR="0" wp14:anchorId="79965D35" wp14:editId="06E85D2B">
+            <wp:extent cx="6290310" cy="3388995"/>
+            <wp:effectExtent l="0" t="0" r="0" b="1905"/>
+            <wp:docPr id="647320201" name="Picture 1"/>
+            <wp:cNvGraphicFramePr>
+              <a:graphicFrameLocks xmlns:a="http://schemas.openxmlformats.org/drawingml/2006/main" noChangeAspect="1"/>
+            </wp:cNvGraphicFramePr>
+            <a:graphic xmlns:a="http://schemas.openxmlformats.org/drawingml/2006/main">
+              <a:graphicData uri="http://schemas.openxmlformats.org/drawingml/2006/picture">
+                <pic:pic xmlns:pic="http://schemas.openxmlformats.org/drawingml/2006/picture">
+                  <pic:nvPicPr>
+                    <pic:cNvPr id="647320201" name=""/>
+                    <pic:cNvPicPr/>
+                  </pic:nvPicPr>
+                  <pic:blipFill>
+                    <a:blip r:embed="rId11"/>
+                    <a:stretch>
+                      <a:fillRect/>
+                    </a:stretch>
+                  </pic:blipFill>
+                  <pic:spPr>
+                    <a:xfrm>
+                      <a:off x="0" y="0"/>
+                      <a:ext cx="6290310" cy="3388995"/>
+                    </a:xfrm>
+                    <a:prstGeom prst="rect">
+                      <a:avLst/>
+                    </a:prstGeom>
+                  </pic:spPr>
+                </pic:pic>
+              </a:graphicData>
+            </a:graphic>
+          </wp:inline>
+        </w:drawing>
+      </w:r>
+    </w:p>
+    <w:p>
+      <w:pPr>
+        <w:pBdr>
+          <w:bottom w:val="single" w:sz="2" w:space="1" w:color="CCCCCC"/>
+        </w:pBdr>
+      </w:pPr>
+    </w:p>
+    <w:p>
+      <w:pPr>
+        <w:pBdr>
+          <w:bottom w:val="single" w:sz="2" w:space="1" w:color="CCCCCC"/>
+        </w:pBdr>
+      </w:pPr>
+    </w:p>
+    <w:p>
+      <w:pPr>
+        <w:pBdr>
+          <w:bottom w:val="single" w:sz="2" w:space="1" w:color="CCCCCC"/>
+        </w:pBdr>
+        <w:rPr>
+          <w:b/>
+          <w:bCs/>
+        </w:rPr>
+      </w:pPr>
+      <w:r>
+        <w:rPr>
+          <w:b/>
+          <w:bCs/>
+        </w:rPr>
+        <w:t>Bài tập 2: Thẻ sách (Book Card) đơn</w:t>
+      </w:r>
+    </w:p>
+    <w:p>
+      <w:pPr>
+        <w:pBdr>
+          <w:bottom w:val="single" w:sz="2" w:space="1" w:color="CCCCCC"/>
+        </w:pBdr>
+      </w:pPr>
+      <w:r>
+        <w:rPr>
+          <w:noProof/>
+        </w:rPr>
+        <w:lastRenderedPageBreak/>
+        <w:drawing>
+          <wp:inline distT="0" distB="0" distL="0" distR="0" wp14:anchorId="6D412EB4" wp14:editId="2BF42BA1">
+            <wp:extent cx="6290310" cy="3211830"/>
+            <wp:effectExtent l="0" t="0" r="0" b="7620"/>
+            <wp:docPr id="779595259" name="Picture 1"/>
+            <wp:cNvGraphicFramePr>
+              <a:graphicFrameLocks xmlns:a="http://schemas.openxmlformats.org/drawingml/2006/main" noChangeAspect="1"/>
+            </wp:cNvGraphicFramePr>
+            <a:graphic xmlns:a="http://schemas.openxmlformats.org/drawingml/2006/main">
+              <a:graphicData uri="http://schemas.openxmlformats.org/drawingml/2006/picture">
+                <pic:pic xmlns:pic="http://schemas.openxmlformats.org/drawingml/2006/picture">
+                  <pic:nvPicPr>
+                    <pic:cNvPr id="779595259" name=""/>
+                    <pic:cNvPicPr/>
+                  </pic:nvPicPr>
+                  <pic:blipFill>
+                    <a:blip r:embed="rId12"/>
+                    <a:stretch>
+                      <a:fillRect/>
+                    </a:stretch>
+                  </pic:blipFill>
+                  <pic:spPr>
+                    <a:xfrm>
+                      <a:off x="0" y="0"/>
+                      <a:ext cx="6290310" cy="3211830"/>
+                    </a:xfrm>
+                    <a:prstGeom prst="rect">
+                      <a:avLst/>
+                    </a:prstGeom>
+                  </pic:spPr>
+                </pic:pic>
+              </a:graphicData>
+            </a:graphic>
+          </wp:inline>
+        </w:drawing>
+      </w:r>
+    </w:p>
+    <w:p>
+      <w:pPr>
+        <w:pBdr>
+          <w:bottom w:val="single" w:sz="2" w:space="1" w:color="CCCCCC"/>
+        </w:pBdr>
+        <w:rPr>
+          <w:b/>
+          <w:bCs/>
+        </w:rPr>
+      </w:pPr>
+    </w:p>
+    <w:p>
+      <w:pPr>
+        <w:pBdr>
+          <w:bottom w:val="single" w:sz="2" w:space="1" w:color="CCCCCC"/>
+        </w:pBdr>
+        <w:rPr>
+          <w:b/>
+          <w:bCs/>
+          <w:sz w:val="36"/>
+          <w:szCs w:val="36"/>
+        </w:rPr>
+      </w:pPr>
+      <w:r>
+        <w:rPr>
+          <w:b/>
+          <w:bCs/>
+          <w:sz w:val="36"/>
+          <w:szCs w:val="36"/>
+        </w:rPr>
+        <w:t>Giờ 2 — Kích thước, Wrap và Lưới sản phẩm (Grid)</w:t>
+      </w:r>
+    </w:p>
+    <w:p>
+      <w:pPr>
+        <w:pBdr>
+          <w:bottom w:val="single" w:sz="2" w:space="1" w:color="CCCCCC"/>
+        </w:pBdr>
+        <w:rPr>
+          <w:b/>
+          <w:bCs/>
+        </w:rPr>
+      </w:pPr>
+      <w:r>
+        <w:rPr>
+          <w:b/>
+          <w:bCs/>
+        </w:rPr>
+        <w:t>Bài tập 1: Danh sách danh mục dạng chip (Category Chips) </w:t>
+      </w:r>
+    </w:p>
+    <w:p>
+      <w:pPr>
+        <w:pBdr>
+          <w:bottom w:val="single" w:sz="2" w:space="1" w:color="CCCCCC"/>
+        </w:pBdr>
+      </w:pPr>
+      <w:r>
+        <w:rPr>
+          <w:noProof/>
+        </w:rPr>
+        <w:drawing>
+          <wp:inline distT="0" distB="0" distL="0" distR="0" wp14:anchorId="01484A60" wp14:editId="189DA064">
+            <wp:extent cx="6290310" cy="3538220"/>
+            <wp:effectExtent l="0" t="0" r="0" b="5080"/>
+            <wp:docPr id="1386162492" name="Picture 1"/>
+            <wp:cNvGraphicFramePr>
+              <a:graphicFrameLocks xmlns:a="http://schemas.openxmlformats.org/drawingml/2006/main" noChangeAspect="1"/>
+            </wp:cNvGraphicFramePr>
+            <a:graphic xmlns:a="http://schemas.openxmlformats.org/drawingml/2006/main">
+              <a:graphicData uri="http://schemas.openxmlformats.org/drawingml/2006/picture">
+                <pic:pic xmlns:pic="http://schemas.openxmlformats.org/drawingml/2006/picture">
+                  <pic:nvPicPr>
+                    <pic:cNvPr id="1386162492" name=""/>
+                    <pic:cNvPicPr/>
+                  </pic:nvPicPr>
+                  <pic:blipFill>
+                    <a:blip r:embed="rId13"/>
+                    <a:stretch>
+                      <a:fillRect/>
+                    </a:stretch>
+                  </pic:blipFill>
+                  <pic:spPr>
+                    <a:xfrm>
+                      <a:off x="0" y="0"/>
+                      <a:ext cx="6290310" cy="3538220"/>
+                    </a:xfrm>
+                    <a:prstGeom prst="rect">
+                      <a:avLst/>
+                    </a:prstGeom>
+                  </pic:spPr>
+                </pic:pic>
+              </a:graphicData>
+            </a:graphic>
+          </wp:inline>
+        </w:drawing>
+      </w:r>
+    </w:p>
+    <w:p>
+      <w:pPr>
+        <w:pBdr>
+          <w:bottom w:val="single" w:sz="2" w:space="1" w:color="CCCCCC"/>
+        </w:pBdr>
+      </w:pPr>
+    </w:p>
+    <w:p>
+      <w:pPr>
+        <w:pBdr>
+          <w:bottom w:val="single" w:sz="2" w:space="1" w:color="CCCCCC"/>
+        </w:pBdr>
+      </w:pPr>
+    </w:p>
+    <w:p>
+      <w:pPr>
+        <w:pBdr>
+          <w:bottom w:val="single" w:sz="2" w:space="1" w:color="CCCCCC"/>
+        </w:pBdr>
+      </w:pPr>
+      <w:r>
+        <w:rPr>
+          <w:b/>
+          <w:bCs/>
+        </w:rPr>
+        <w:t>Bài tập 2: Lưới sản phẩm 2 cột (Book Grid)</w:t>
+      </w:r>
+    </w:p>
+    <w:p>
+      <w:pPr>
+        <w:pBdr>
+          <w:bottom w:val="single" w:sz="2" w:space="1" w:color="CCCCCC"/>
+        </w:pBdr>
+        <w:rPr>
+          <w:sz w:val="36"/>
+          <w:szCs w:val="36"/>
+        </w:rPr>
+      </w:pPr>
+      <w:r>
+        <w:rPr>
+          <w:noProof/>
+          <w:sz w:val="36"/>
+          <w:szCs w:val="36"/>
+        </w:rPr>
+        <w:lastRenderedPageBreak/>
+        <w:drawing>
+          <wp:inline distT="0" distB="0" distL="0" distR="0" wp14:anchorId="2443FE59" wp14:editId="45240EB2">
+            <wp:extent cx="6290310" cy="3538220"/>
+            <wp:effectExtent l="0" t="0" r="0" b="5080"/>
+            <wp:docPr id="494506925" name="Picture 1"/>
+            <wp:cNvGraphicFramePr>
+              <a:graphicFrameLocks xmlns:a="http://schemas.openxmlformats.org/drawingml/2006/main" noChangeAspect="1"/>
+            </wp:cNvGraphicFramePr>
+            <a:graphic xmlns:a="http://schemas.openxmlformats.org/drawingml/2006/main">
+              <a:graphicData uri="http://schemas.openxmlformats.org/drawingml/2006/picture">
+                <pic:pic xmlns:pic="http://schemas.openxmlformats.org/drawingml/2006/picture">
+                  <pic:nvPicPr>
+                    <pic:cNvPr id="494506925" name=""/>
+                    <pic:cNvPicPr/>
+                  </pic:nvPicPr>
+                  <pic:blipFill>
+                    <a:blip r:embed="rId14"/>
+                    <a:stretch>
+                      <a:fillRect/>
+                    </a:stretch>
+                  </pic:blipFill>
+                  <pic:spPr>
+                    <a:xfrm>
+                      <a:off x="0" y="0"/>
+                      <a:ext cx="6290310" cy="3538220"/>
+                    </a:xfrm>
+                    <a:prstGeom prst="rect">
+                      <a:avLst/>
+                    </a:prstGeom>
+                  </pic:spPr>
+                </pic:pic>
+              </a:graphicData>
+            </a:graphic>
+          </wp:inline>
+        </w:drawing>
+      </w:r>
+    </w:p>
+    <w:p>
+      <w:pPr>
+        <w:pBdr>
+          <w:bottom w:val="single" w:sz="2" w:space="1" w:color="CCCCCC"/>
+        </w:pBdr>
+        <w:rPr>
           <w:sz w:val="36"/>
           <w:szCs w:val="36"/>
         </w:rPr>
@@ -525,7 +1628,6 @@
           <w:sz w:val="36"/>
           <w:szCs w:val="36"/>
         </w:rPr>
-        <w:lastRenderedPageBreak/>
         <w:drawing>
           <wp:inline distT="0" distB="0" distL="0" distR="0" wp14:anchorId="5EB0CAC4" wp14:editId="206F16D9">
             <wp:extent cx="6290310" cy="3576320"/>
@@ -542,7 +1644,7 @@
                     <pic:cNvPicPr/>
                   </pic:nvPicPr>
                   <pic:blipFill>
-                    <a:blip r:embed="rId10"/>
+                    <a:blip r:embed="rId15"/>
                     <a:stretch>
                       <a:fillRect/>
                     </a:stretch>
@@ -615,6 +1717,7 @@
           <w:sz w:val="36"/>
           <w:szCs w:val="36"/>
         </w:rPr>
+        <w:lastRenderedPageBreak/>
         <w:drawing>
           <wp:inline distT="0" distB="0" distL="0" distR="0" wp14:anchorId="3ED850D6" wp14:editId="015F2121">
             <wp:extent cx="6290310" cy="3376930"/>
@@ -631,7 +1734,7 @@
                     <pic:cNvPicPr/>
                   </pic:nvPicPr>
                   <pic:blipFill>
-                    <a:blip r:embed="rId11"/>
+                    <a:blip r:embed="rId16"/>
                     <a:stretch>
                       <a:fillRect/>
                     </a:stretch>
@@ -676,6 +1779,95 @@
 <file path=word/numbering.xml><?xml version="1.0" encoding="utf-8"?>
 <w:numbering xmlns:wpc="http://schemas.microsoft.com/office/word/2010/wordprocessingCanvas" xmlns:cx="http://schemas.microsoft.com/office/drawing/2014/chartex" xmlns:cx1="http://schemas.microsoft.com/office/drawing/2015/9/8/chartex" xmlns:cx2="http://schemas.microsoft.com/office/drawing/2015/10/21/chartex" xmlns:cx3="http://schemas.microsoft.com/office/drawing/2016/5/9/chartex" xmlns:cx4="http://schemas.microsoft.com/office/drawing/2016/5/10/chartex" xmlns:cx5="http://schemas.microsoft.com/office/drawing/2016/5/11/chartex" xmlns:cx6="http://schemas.microsoft.com/office/drawing/2016/5/12/chartex" xmlns:cx7="http://schemas.microsoft.com/office/drawing/2016/5/13/chartex" xmlns:cx8="http://schemas.microsoft.com/office/drawing/2016/5/14/chartex" xmlns:mc="http://schemas.openxmlformats.org/markup-compatibility/2006" xmlns:aink="http://schemas.microsoft.com/office/drawing/2016/ink" xmlns:am3d="http://schemas.microsoft.com/office/drawing/2017/model3d" xmlns:o="urn:schemas-microsoft-com:office:office" xmlns:oel="http://schemas.microsoft.com/office/2019/extlst" xmlns:r="http://schemas.openxmlformats.org/officeDocument/2006/relationships" xmlns:m="http://schemas.openxmlformats.org/officeDocument/2006/math" xmlns:v="urn:schemas-microsoft-com:vml" xmlns:wp14="http://schemas.microsoft.com/office/word/2010/wordprocessingDrawing" xmlns:wp="http://schemas.openxmlformats.org/drawingml/2006/wordprocessingDrawing" xmlns:w10="urn:schemas-microsoft-com:office:word" xmlns:w="http://schemas.openxmlformats.org/wordprocessingml/2006/main" xmlns:w14="http://schemas.microsoft.com/office/word/2010/wordml" xmlns:w15="http://schemas.microsoft.com/office/word/2012/wordml" xmlns:w16cei="http://schemas.microsoft.com/office/word/2026/wordml/cei" xmlns:w16cex="http://schemas.microsoft.com/office/word/2018/wordml/cex" xmlns:w16cid="http://schemas.microsoft.com/office/word/2016/wordml/cid" xmlns:w16="http://schemas.microsoft.com/office/word/2018/wordml" xmlns:w16du="http://schemas.microsoft.com/office/word/2023/wordml/word16du" xmlns:w16sdtdh="http://schemas.microsoft.com/office/word/2020/wordml/sdtdatahash" xmlns:w16sdtfl="http://schemas.microsoft.com/office/word/2024/wordml/sdtformatlock" xmlns:w16se="http://schemas.microsoft.com/office/word/2015/wordml/symex" xmlns:wpg="http://schemas.microsoft.com/office/word/2010/wordprocessingGroup" xmlns:wpi="http://schemas.microsoft.com/office/word/2010/wordprocessingInk" xmlns:wne="http://schemas.microsoft.com/office/word/2006/wordml" xmlns:wps="http://schemas.microsoft.com/office/word/2010/wordprocessingShape" mc:Ignorable="w14 w15 w16se w16cid w16 w16cex w16sdtdh w16sdtfl w16du wp14">
   <w:abstractNum w:abstractNumId="0" w15:restartNumberingAfterBreak="0">
+    <w:nsid w:val="59236474"/>
+    <w:multiLevelType w:val="hybridMultilevel"/>
+    <w:tmpl w:val="8634FD00"/>
+    <w:lvl w:ilvl="0" w:tplc="0409000F">
+      <w:start w:val="1"/>
+      <w:numFmt w:val="decimal"/>
+      <w:lvlText w:val="%1."/>
+      <w:lvlJc w:val="left"/>
+      <w:pPr>
+        <w:ind w:left="720" w:hanging="360"/>
+      </w:pPr>
+      <w:rPr>
+        <w:rFonts w:hint="default"/>
+      </w:rPr>
+    </w:lvl>
+    <w:lvl w:ilvl="1" w:tplc="04090019" w:tentative="1">
+      <w:start w:val="1"/>
+      <w:numFmt w:val="lowerLetter"/>
+      <w:lvlText w:val="%2."/>
+      <w:lvlJc w:val="left"/>
+      <w:pPr>
+        <w:ind w:left="1440" w:hanging="360"/>
+      </w:pPr>
+    </w:lvl>
+    <w:lvl w:ilvl="2" w:tplc="0409001B" w:tentative="1">
+      <w:start w:val="1"/>
+      <w:numFmt w:val="lowerRoman"/>
+      <w:lvlText w:val="%3."/>
+      <w:lvlJc w:val="right"/>
+      <w:pPr>
+        <w:ind w:left="2160" w:hanging="180"/>
+      </w:pPr>
+    </w:lvl>
+    <w:lvl w:ilvl="3" w:tplc="0409000F" w:tentative="1">
+      <w:start w:val="1"/>
+      <w:numFmt w:val="decimal"/>
+      <w:lvlText w:val="%4."/>
+      <w:lvlJc w:val="left"/>
+      <w:pPr>
+        <w:ind w:left="2880" w:hanging="360"/>
+      </w:pPr>
+    </w:lvl>
+    <w:lvl w:ilvl="4" w:tplc="04090019" w:tentative="1">
+      <w:start w:val="1"/>
+      <w:numFmt w:val="lowerLetter"/>
+      <w:lvlText w:val="%5."/>
+      <w:lvlJc w:val="left"/>
+      <w:pPr>
+        <w:ind w:left="3600" w:hanging="360"/>
+      </w:pPr>
+    </w:lvl>
+    <w:lvl w:ilvl="5" w:tplc="0409001B" w:tentative="1">
+      <w:start w:val="1"/>
+      <w:numFmt w:val="lowerRoman"/>
+      <w:lvlText w:val="%6."/>
+      <w:lvlJc w:val="right"/>
+      <w:pPr>
+        <w:ind w:left="4320" w:hanging="180"/>
+      </w:pPr>
+    </w:lvl>
+    <w:lvl w:ilvl="6" w:tplc="0409000F" w:tentative="1">
+      <w:start w:val="1"/>
+      <w:numFmt w:val="decimal"/>
+      <w:lvlText w:val="%7."/>
+      <w:lvlJc w:val="left"/>
+      <w:pPr>
+        <w:ind w:left="5040" w:hanging="360"/>
+      </w:pPr>
+    </w:lvl>
+    <w:lvl w:ilvl="7" w:tplc="04090019" w:tentative="1">
+      <w:start w:val="1"/>
+      <w:numFmt w:val="lowerLetter"/>
+      <w:lvlText w:val="%8."/>
+      <w:lvlJc w:val="left"/>
+      <w:pPr>
+        <w:ind w:left="5760" w:hanging="360"/>
+      </w:pPr>
+    </w:lvl>
+    <w:lvl w:ilvl="8" w:tplc="0409001B" w:tentative="1">
+      <w:start w:val="1"/>
+      <w:numFmt w:val="lowerRoman"/>
+      <w:lvlText w:val="%9."/>
+      <w:lvlJc w:val="right"/>
+      <w:pPr>
+        <w:ind w:left="6480" w:hanging="180"/>
+      </w:pPr>
+    </w:lvl>
+  </w:abstractNum>
+  <w:abstractNum w:abstractNumId="1" w15:restartNumberingAfterBreak="0">
     <w:nsid w:val="5B256D49"/>
     <w:multiLevelType w:val="hybridMultilevel"/>
     <w:tmpl w:val="865CECA2"/>
@@ -762,10 +1954,13 @@
     </w:lvl>
   </w:abstractNum>
   <w:num w:numId="1" w16cid:durableId="1446537208">
-    <w:abstractNumId w:val="0"/>
+    <w:abstractNumId w:val="1"/>
     <w:lvlOverride w:ilvl="0">
       <w:startOverride w:val="1"/>
     </w:lvlOverride>
+  </w:num>
+  <w:num w:numId="2" w16cid:durableId="545918144">
+    <w:abstractNumId w:val="0"/>
   </w:num>
 </w:numbering>
 </file>

</xml_diff>